<commit_message>
fiks laporan Revisi ke 3
</commit_message>
<xml_diff>
--- a/docs/reports/laporan_akhir_pbl_apotek.docx
+++ b/docs/reports/laporan_akhir_pbl_apotek.docx
@@ -4,7 +4,7 @@
   <w:body>
     <w:p>
       <w:pPr>
-        <w:spacing w:after="320"/>
+        <w:spacing w:after="0" w:line="240" w:lineRule="auto"/>
         <w:jc w:val="center"/>
         <w:rPr>
           <w:rFonts w:ascii="Times New Roman" w:hAnsi="Times New Roman"/>
@@ -13,83 +13,21 @@
           <w:sz w:val="28"/>
           <w:szCs w:val="28"/>
         </w:rPr>
+        <w:sectPr>
+          <w:pgSz w:w="11906" w:h="16838"/>
+          <w:pgMar w:top="0" w:right="0" w:bottom="0" w:left="0" w:header="0" w:footer="0" w:gutter="0"/>
+          <w:cols w:space="720"/>
+        </w:sectPr>
       </w:pPr>
       <w:r>
         <w:rPr>
-          <w:rFonts w:ascii="Times New Roman" w:hAnsi="Times New Roman"/>
-          <w:b/>
-          <w:color w:val="000000"/>
-          <w:sz w:val="28"/>
-          <w:szCs w:val="28"/>
-        </w:rPr>
-        <w:t>LAPORAN AKHIR PROJECT-BASED LEARNING (PBL)</w:t>
-      </w:r>
-    </w:p>
-    <w:p>
-      <w:pPr>
-        <w:spacing w:after="320"/>
-        <w:jc w:val="center"/>
-        <w:rPr>
-          <w:rFonts w:ascii="Times New Roman" w:hAnsi="Times New Roman"/>
-          <w:b/>
-          <w:color w:val="000000"/>
-          <w:sz w:val="28"/>
-          <w:szCs w:val="28"/>
-        </w:rPr>
-      </w:pPr>
-      <w:r>
-        <w:rPr>
-          <w:rFonts w:ascii="Times New Roman" w:hAnsi="Times New Roman"/>
-          <w:b/>
-          <w:color w:val="000000"/>
-          <w:sz w:val="28"/>
-          <w:szCs w:val="28"/>
-        </w:rPr>
-        <w:t>RANCANG BANGUN SISTEM INFORMASI APOTEK BERBASIS WEB</w:t>
-      </w:r>
-      <w:r>
-        <w:rPr>
-          <w:rFonts w:ascii="Times New Roman" w:hAnsi="Times New Roman"/>
-          <w:b/>
-          <w:color w:val="000000"/>
-          <w:sz w:val="28"/>
-          <w:szCs w:val="28"/>
-        </w:rPr>
-        <w:br/>
-        <w:t>(APOTEKSIM) DENGAN ARSITEKTUR MODERN FULL-STACK</w:t>
-      </w:r>
-      <w:r>
-        <w:rPr>
-          <w:rFonts w:ascii="Times New Roman" w:hAnsi="Times New Roman"/>
-          <w:b/>
-          <w:color w:val="000000"/>
-          <w:sz w:val="28"/>
-          <w:szCs w:val="28"/>
-        </w:rPr>
-        <w:br/>
-        <w:t>DAN INTEGRASI SUPABASE</w:t>
-      </w:r>
-    </w:p>
-    <w:p>
-      <w:pPr>
-        <w:spacing w:after="320"/>
-        <w:jc w:val="center"/>
-      </w:pPr>
-    </w:p>
-    <w:p>
-      <w:pPr>
-        <w:spacing w:before="120" w:after="80"/>
-        <w:jc w:val="center"/>
-      </w:pPr>
-      <w:r>
-        <w:rPr>
           <w:noProof/>
         </w:rPr>
         <w:drawing>
-          <wp:inline distT="0" distB="0" distL="0" distR="0" wp14:anchorId="15D19098" wp14:editId="23A4E393">
-            <wp:extent cx="2011680" cy="1949918"/>
+          <wp:inline distT="0" distB="0" distL="0" distR="0" wp14:anchorId="7BAC01F4" wp14:editId="10D3EC59">
+            <wp:extent cx="7560000" cy="10692000"/>
             <wp:effectExtent l="0" t="0" r="0" b="0"/>
-            <wp:docPr id="1" name="Picture 1"/>
+            <wp:docPr id="2084542875" name="Picture 2084542875"/>
             <wp:cNvGraphicFramePr>
               <a:graphicFrameLocks xmlns:a="http://schemas.openxmlformats.org/drawingml/2006/main" noChangeAspect="1"/>
             </wp:cNvGraphicFramePr>
@@ -97,7 +35,7 @@
               <a:graphicData uri="http://schemas.openxmlformats.org/drawingml/2006/picture">
                 <pic:pic xmlns:pic="http://schemas.openxmlformats.org/drawingml/2006/picture">
                   <pic:nvPicPr>
-                    <pic:cNvPr id="0" name="UNITOMO.jpg"/>
+                    <pic:cNvPr id="0" name="cover_laporan_page1.png"/>
                     <pic:cNvPicPr/>
                   </pic:nvPicPr>
                   <pic:blipFill>
@@ -109,7 +47,7 @@
                   <pic:spPr>
                     <a:xfrm>
                       <a:off x="0" y="0"/>
-                      <a:ext cx="2011680" cy="1949918"/>
+                      <a:ext cx="7560000" cy="10692000"/>
                     </a:xfrm>
                     <a:prstGeom prst="rect">
                       <a:avLst/>
@@ -120,250 +58,6 @@
             </a:graphic>
           </wp:inline>
         </w:drawing>
-      </w:r>
-    </w:p>
-    <w:p>
-      <w:pPr>
-        <w:spacing w:before="120" w:after="80"/>
-        <w:jc w:val="center"/>
-        <w:rPr>
-          <w:rFonts w:ascii="Times New Roman" w:hAnsi="Times New Roman"/>
-          <w:b/>
-          <w:color w:val="000000"/>
-          <w:sz w:val="24"/>
-        </w:rPr>
-      </w:pPr>
-    </w:p>
-    <w:p>
-      <w:pPr>
-        <w:spacing w:before="120" w:after="80"/>
-        <w:jc w:val="center"/>
-        <w:rPr>
-          <w:rFonts w:ascii="Times New Roman" w:hAnsi="Times New Roman"/>
-          <w:b/>
-          <w:color w:val="000000"/>
-          <w:sz w:val="24"/>
-        </w:rPr>
-      </w:pPr>
-    </w:p>
-    <w:p>
-      <w:pPr>
-        <w:spacing w:before="120" w:after="80"/>
-        <w:jc w:val="center"/>
-      </w:pPr>
-      <w:proofErr w:type="spellStart"/>
-      <w:r>
-        <w:rPr>
-          <w:rFonts w:ascii="Times New Roman" w:hAnsi="Times New Roman"/>
-          <w:b/>
-          <w:color w:val="000000"/>
-          <w:sz w:val="24"/>
-        </w:rPr>
-        <w:t>Disusun</w:t>
-      </w:r>
-      <w:proofErr w:type="spellEnd"/>
-      <w:r>
-        <w:rPr>
-          <w:rFonts w:ascii="Times New Roman" w:hAnsi="Times New Roman"/>
-          <w:b/>
-          <w:color w:val="000000"/>
-          <w:sz w:val="24"/>
-        </w:rPr>
-        <w:t xml:space="preserve"> Oleh </w:t>
-      </w:r>
-      <w:proofErr w:type="spellStart"/>
-      <w:r>
-        <w:rPr>
-          <w:rFonts w:ascii="Times New Roman" w:hAnsi="Times New Roman"/>
-          <w:b/>
-          <w:color w:val="000000"/>
-          <w:sz w:val="24"/>
-        </w:rPr>
-        <w:t>Kelompok</w:t>
-      </w:r>
-      <w:proofErr w:type="spellEnd"/>
-      <w:r>
-        <w:rPr>
-          <w:rFonts w:ascii="Times New Roman" w:hAnsi="Times New Roman"/>
-          <w:b/>
-          <w:color w:val="000000"/>
-          <w:sz w:val="24"/>
-        </w:rPr>
-        <w:t xml:space="preserve"> 11</w:t>
-      </w:r>
-      <w:r>
-        <w:rPr>
-          <w:rFonts w:ascii="Times New Roman" w:hAnsi="Times New Roman"/>
-          <w:b/>
-          <w:color w:val="000000"/>
-          <w:sz w:val="24"/>
-        </w:rPr>
-        <w:t>:</w:t>
-      </w:r>
-      <w:r>
-        <w:rPr>
-          <w:rFonts w:ascii="Times New Roman" w:hAnsi="Times New Roman"/>
-          <w:b/>
-          <w:color w:val="000000"/>
-          <w:sz w:val="24"/>
-        </w:rPr>
-        <w:br/>
-      </w:r>
-    </w:p>
-    <w:p>
-      <w:pPr>
-        <w:spacing w:before="320" w:after="160"/>
-        <w:jc w:val="center"/>
-        <w:rPr>
-          <w:rFonts w:ascii="Times New Roman" w:hAnsi="Times New Roman"/>
-          <w:b/>
-          <w:color w:val="000000"/>
-          <w:sz w:val="24"/>
-        </w:rPr>
-      </w:pPr>
-      <w:r>
-        <w:rPr>
-          <w:rFonts w:ascii="Times New Roman" w:hAnsi="Times New Roman"/>
-          <w:b/>
-          <w:color w:val="000000"/>
-          <w:sz w:val="24"/>
-        </w:rPr>
-        <w:t>Fahri Adis Al Hafni – NIM: 202511420105</w:t>
-      </w:r>
-    </w:p>
-    <w:p>
-      <w:pPr>
-        <w:spacing w:before="320" w:after="160"/>
-        <w:jc w:val="center"/>
-        <w:rPr>
-          <w:rFonts w:ascii="Times New Roman" w:hAnsi="Times New Roman"/>
-          <w:b/>
-          <w:color w:val="000000"/>
-          <w:sz w:val="24"/>
-        </w:rPr>
-      </w:pPr>
-      <w:proofErr w:type="spellStart"/>
-      <w:r>
-        <w:rPr>
-          <w:rFonts w:ascii="Times New Roman" w:hAnsi="Times New Roman"/>
-          <w:b/>
-          <w:color w:val="000000"/>
-          <w:sz w:val="24"/>
-        </w:rPr>
-        <w:t>Sahrul</w:t>
-      </w:r>
-      <w:proofErr w:type="spellEnd"/>
-      <w:r>
-        <w:rPr>
-          <w:rFonts w:ascii="Times New Roman" w:hAnsi="Times New Roman"/>
-          <w:b/>
-          <w:color w:val="000000"/>
-          <w:sz w:val="24"/>
-        </w:rPr>
-        <w:t xml:space="preserve"> </w:t>
-      </w:r>
-      <w:proofErr w:type="spellStart"/>
-      <w:r>
-        <w:rPr>
-          <w:rFonts w:ascii="Times New Roman" w:hAnsi="Times New Roman"/>
-          <w:b/>
-          <w:color w:val="000000"/>
-          <w:sz w:val="24"/>
-        </w:rPr>
-        <w:t>Mubarok</w:t>
-      </w:r>
-      <w:proofErr w:type="spellEnd"/>
-      <w:r>
-        <w:rPr>
-          <w:rFonts w:ascii="Times New Roman" w:hAnsi="Times New Roman"/>
-          <w:b/>
-          <w:color w:val="000000"/>
-          <w:sz w:val="24"/>
-        </w:rPr>
-        <w:t xml:space="preserve"> – NIM: 202511420107</w:t>
-      </w:r>
-    </w:p>
-    <w:p>
-      <w:pPr>
-        <w:spacing w:before="320" w:after="160"/>
-        <w:jc w:val="center"/>
-        <w:rPr>
-          <w:rFonts w:ascii="Times New Roman" w:hAnsi="Times New Roman"/>
-          <w:b/>
-          <w:color w:val="000000"/>
-          <w:sz w:val="24"/>
-        </w:rPr>
-      </w:pPr>
-      <w:r>
-        <w:rPr>
-          <w:rFonts w:ascii="Times New Roman" w:hAnsi="Times New Roman"/>
-          <w:b/>
-          <w:color w:val="000000"/>
-          <w:sz w:val="24"/>
-        </w:rPr>
-        <w:t>Ach Tohir – NIM: 202511420048</w:t>
-      </w:r>
-    </w:p>
-    <w:p>
-      <w:pPr>
-        <w:spacing w:before="320" w:after="160"/>
-        <w:jc w:val="center"/>
-        <w:rPr>
-          <w:rFonts w:ascii="Times New Roman" w:hAnsi="Times New Roman"/>
-          <w:b/>
-          <w:color w:val="000000"/>
-          <w:sz w:val="24"/>
-        </w:rPr>
-      </w:pPr>
-      <w:r>
-        <w:rPr>
-          <w:rFonts w:ascii="Times New Roman" w:hAnsi="Times New Roman"/>
-          <w:b/>
-          <w:color w:val="000000"/>
-          <w:sz w:val="24"/>
-        </w:rPr>
-        <w:br/>
-        <w:t>PROGRAM STUDI TEKNIK INFORMATIKA</w:t>
-      </w:r>
-      <w:r>
-        <w:rPr>
-          <w:rFonts w:ascii="Times New Roman" w:hAnsi="Times New Roman"/>
-          <w:b/>
-          <w:color w:val="000000"/>
-          <w:sz w:val="24"/>
-        </w:rPr>
-        <w:br/>
-        <w:t>FAKULTAS TEKNIK</w:t>
-      </w:r>
-      <w:r>
-        <w:rPr>
-          <w:rFonts w:ascii="Times New Roman" w:hAnsi="Times New Roman"/>
-          <w:b/>
-          <w:color w:val="000000"/>
-          <w:sz w:val="24"/>
-        </w:rPr>
-        <w:br/>
-        <w:t>UNIVERSITAS DR. SOETOMO</w:t>
-      </w:r>
-      <w:r>
-        <w:rPr>
-          <w:rFonts w:ascii="Times New Roman" w:hAnsi="Times New Roman"/>
-          <w:b/>
-          <w:color w:val="000000"/>
-          <w:sz w:val="24"/>
-        </w:rPr>
-        <w:br/>
-        <w:t>SURABAYA</w:t>
-      </w:r>
-      <w:r>
-        <w:rPr>
-          <w:rFonts w:ascii="Times New Roman" w:hAnsi="Times New Roman"/>
-          <w:b/>
-          <w:color w:val="000000"/>
-          <w:sz w:val="24"/>
-        </w:rPr>
-        <w:br/>
-        <w:t>2026</w:t>
       </w:r>
     </w:p>
     <w:p>
@@ -4277,6 +3971,12 @@
         <w:rPr>
           <w:rFonts w:ascii="Times New Roman" w:hAnsi="Times New Roman"/>
         </w:rPr>
+        <w:t xml:space="preserve">  </w:t>
+      </w:r>
+      <w:r>
+        <w:rPr>
+          <w:rFonts w:ascii="Times New Roman" w:hAnsi="Times New Roman"/>
+        </w:rPr>
         <w:t xml:space="preserve">6.2 </w:t>
       </w:r>
       <w:proofErr w:type="spellStart"/>
@@ -4323,7 +4023,6 @@
         </w:rPr>
       </w:pPr>
       <w:r>
-        <w:lastRenderedPageBreak/>
         <w:t xml:space="preserve">       </w:t>
       </w:r>
       <w:r>
@@ -4476,6 +4175,7 @@
         </w:rPr>
       </w:pPr>
       <w:r>
+        <w:lastRenderedPageBreak/>
         <w:t xml:space="preserve">   </w:t>
       </w:r>
       <w:r>
@@ -4922,11 +4622,6 @@
           <w:rFonts w:ascii="Times New Roman" w:hAnsi="Times New Roman"/>
         </w:rPr>
         <w:tab/>
-      </w:r>
-      <w:r>
-        <w:rPr>
-          <w:rFonts w:ascii="Times New Roman" w:hAnsi="Times New Roman"/>
-        </w:rPr>
         <w:t>11</w:t>
       </w:r>
     </w:p>
@@ -4968,11 +4663,6 @@
           <w:rFonts w:ascii="Times New Roman" w:hAnsi="Times New Roman"/>
         </w:rPr>
         <w:tab/>
-      </w:r>
-      <w:r>
-        <w:rPr>
-          <w:rFonts w:ascii="Times New Roman" w:hAnsi="Times New Roman"/>
-        </w:rPr>
         <w:t>11</w:t>
       </w:r>
     </w:p>
@@ -5028,11 +4718,6 @@
           <w:rFonts w:ascii="Times New Roman" w:hAnsi="Times New Roman"/>
         </w:rPr>
         <w:tab/>
-      </w:r>
-      <w:r>
-        <w:rPr>
-          <w:rFonts w:ascii="Times New Roman" w:hAnsi="Times New Roman"/>
-        </w:rPr>
         <w:t>12</w:t>
       </w:r>
     </w:p>
@@ -5088,11 +4773,6 @@
           <w:rFonts w:ascii="Times New Roman" w:hAnsi="Times New Roman"/>
         </w:rPr>
         <w:tab/>
-      </w:r>
-      <w:r>
-        <w:rPr>
-          <w:rFonts w:ascii="Times New Roman" w:hAnsi="Times New Roman"/>
-        </w:rPr>
         <w:t>12</w:t>
       </w:r>
     </w:p>
@@ -5142,11 +4822,6 @@
           <w:rFonts w:ascii="Times New Roman" w:hAnsi="Times New Roman"/>
         </w:rPr>
         <w:tab/>
-      </w:r>
-      <w:r>
-        <w:rPr>
-          <w:rFonts w:ascii="Times New Roman" w:hAnsi="Times New Roman"/>
-        </w:rPr>
         <w:t>13</w:t>
       </w:r>
     </w:p>
@@ -5202,11 +4877,6 @@
           <w:rFonts w:ascii="Times New Roman" w:hAnsi="Times New Roman"/>
         </w:rPr>
         <w:tab/>
-      </w:r>
-      <w:r>
-        <w:rPr>
-          <w:rFonts w:ascii="Times New Roman" w:hAnsi="Times New Roman"/>
-        </w:rPr>
         <w:t>13</w:t>
       </w:r>
     </w:p>
@@ -6084,11 +5754,10 @@
         </w:rPr>
         <w:sectPr>
           <w:footerReference w:type="default" r:id="rId9"/>
-          <w:pgSz w:w="12240" w:h="15840"/>
-          <w:pgMar w:top="1440" w:right="1440" w:bottom="1440" w:left="1440" w:header="720" w:footer="720" w:gutter="0"/>
-          <w:pgNumType w:fmt="lowerRoman" w:start="1"/>
+          <w:pgSz w:w="11906" w:h="16838"/>
+          <w:pgMar w:top="1440" w:right="1440" w:bottom="1440" w:left="1800" w:header="720" w:footer="720" w:gutter="0"/>
+          <w:pgNumType w:fmt="lowerRoman" w:start="2"/>
           <w:cols w:space="720"/>
-          <w:titlePg/>
           <w:docGrid w:linePitch="299"/>
         </w:sectPr>
       </w:pPr>
@@ -27204,7 +26873,39 @@
           <w:rFonts w:ascii="Times New Roman" w:hAnsi="Times New Roman"/>
           <w:sz w:val="24"/>
         </w:rPr>
-        <w:t xml:space="preserve">Rancangan halaman ini difokuskan pada antarmuka minimalis dengan form card di tengah layar </w:t>
+        <w:t xml:space="preserve">Rancangan halaman ini difokuskan pada antarmuka minimalis dengan form card di </w:t>
+      </w:r>
+      <w:proofErr w:type="spellStart"/>
+      <w:r>
+        <w:rPr>
+          <w:rFonts w:ascii="Times New Roman" w:hAnsi="Times New Roman"/>
+          <w:sz w:val="24"/>
+        </w:rPr>
+        <w:t>tengah</w:t>
+      </w:r>
+      <w:proofErr w:type="spellEnd"/>
+      <w:r>
+        <w:rPr>
+          <w:rFonts w:ascii="Times New Roman" w:hAnsi="Times New Roman"/>
+          <w:sz w:val="24"/>
+        </w:rPr>
+        <w:t xml:space="preserve"> </w:t>
+      </w:r>
+      <w:proofErr w:type="spellStart"/>
+      <w:r>
+        <w:rPr>
+          <w:rFonts w:ascii="Times New Roman" w:hAnsi="Times New Roman"/>
+          <w:sz w:val="24"/>
+        </w:rPr>
+        <w:t>layar</w:t>
+      </w:r>
+      <w:proofErr w:type="spellEnd"/>
+      <w:r>
+        <w:rPr>
+          <w:rFonts w:ascii="Times New Roman" w:hAnsi="Times New Roman"/>
+          <w:sz w:val="24"/>
+        </w:rPr>
+        <w:t xml:space="preserve"> </w:t>
       </w:r>
       <w:proofErr w:type="spellStart"/>
       <w:r>
@@ -27710,7 +27411,55 @@
           <w:rFonts w:ascii="Times New Roman" w:hAnsi="Times New Roman"/>
           <w:sz w:val="24"/>
         </w:rPr>
-        <w:t xml:space="preserve">Desain layout laporan menggunakan pola navigasi sidebar di sebelah kiri dan area konten di sebelah kanan yang </w:t>
+        <w:t xml:space="preserve">Desain layout laporan menggunakan pola navigasi sidebar di sebelah kiri dan area </w:t>
+      </w:r>
+      <w:proofErr w:type="spellStart"/>
+      <w:r>
+        <w:rPr>
+          <w:rFonts w:ascii="Times New Roman" w:hAnsi="Times New Roman"/>
+          <w:sz w:val="24"/>
+        </w:rPr>
+        <w:t>konten</w:t>
+      </w:r>
+      <w:proofErr w:type="spellEnd"/>
+      <w:r>
+        <w:rPr>
+          <w:rFonts w:ascii="Times New Roman" w:hAnsi="Times New Roman"/>
+          <w:sz w:val="24"/>
+        </w:rPr>
+        <w:t xml:space="preserve"> di </w:t>
+      </w:r>
+      <w:proofErr w:type="spellStart"/>
+      <w:r>
+        <w:rPr>
+          <w:rFonts w:ascii="Times New Roman" w:hAnsi="Times New Roman"/>
+          <w:sz w:val="24"/>
+        </w:rPr>
+        <w:t>sebelah</w:t>
+      </w:r>
+      <w:proofErr w:type="spellEnd"/>
+      <w:r>
+        <w:rPr>
+          <w:rFonts w:ascii="Times New Roman" w:hAnsi="Times New Roman"/>
+          <w:sz w:val="24"/>
+        </w:rPr>
+        <w:t xml:space="preserve"> </w:t>
+      </w:r>
+      <w:proofErr w:type="spellStart"/>
+      <w:r>
+        <w:rPr>
+          <w:rFonts w:ascii="Times New Roman" w:hAnsi="Times New Roman"/>
+          <w:sz w:val="24"/>
+        </w:rPr>
+        <w:t>kanan</w:t>
+      </w:r>
+      <w:proofErr w:type="spellEnd"/>
+      <w:r>
+        <w:rPr>
+          <w:rFonts w:ascii="Times New Roman" w:hAnsi="Times New Roman"/>
+          <w:sz w:val="24"/>
+        </w:rPr>
+        <w:t xml:space="preserve"> yang </w:t>
       </w:r>
       <w:proofErr w:type="spellStart"/>
       <w:r>
@@ -46517,6 +46266,7 @@
   <w:style w:type="character" w:default="1" w:styleId="DefaultParagraphFont">
     <w:name w:val="Default Paragraph Font"/>
     <w:uiPriority w:val="1"/>
+    <w:semiHidden/>
     <w:unhideWhenUsed/>
   </w:style>
   <w:style w:type="table" w:default="1" w:styleId="TableNormal">

</xml_diff>